<commit_message>
Embed figurer direkte i rapport.docx
Skriptet setter nå inn PNG-figurene automatisk der
→ Figur:-referansene står i kapitelfilene.
rapport.docx: 58 KB → 1,4 MB med alle 5 figurer.

Co-Authored-By: Claude Sonnet 4.6 <noreply@anthropic.com>
</commit_message>
<xml_diff>
--- a/rapport.docx
+++ b/rapport.docx
@@ -4756,25 +4756,56 @@
     </w:p>
     <w:p>
       <w:pPr>
-        <w:spacing w:after="120"/>
+        <w:jc w:val="center"/>
+      </w:pPr>
+      <w:r>
+        <w:drawing>
+          <wp:inline xmlns:a="http://schemas.openxmlformats.org/drawingml/2006/main" xmlns:pic="http://schemas.openxmlformats.org/drawingml/2006/picture">
+            <wp:extent cx="5040000" cy="2858905"/>
+            <wp:docPr id="1" name="Picture 1"/>
+            <wp:cNvGraphicFramePr>
+              <a:graphicFrameLocks noChangeAspect="1"/>
+            </wp:cNvGraphicFramePr>
+            <a:graphic>
+              <a:graphicData uri="http://schemas.openxmlformats.org/drawingml/2006/picture">
+                <pic:pic>
+                  <pic:nvPicPr>
+                    <pic:cNvPr id="0" name="fig6_1_ukentlig_salg.png"/>
+                    <pic:cNvPicPr/>
+                  </pic:nvPicPr>
+                  <pic:blipFill>
+                    <a:blip r:embed="rId9"/>
+                    <a:stretch>
+                      <a:fillRect/>
+                    </a:stretch>
+                  </pic:blipFill>
+                  <pic:spPr>
+                    <a:xfrm>
+                      <a:off x="0" y="0"/>
+                      <a:ext cx="5040000" cy="2858905"/>
+                    </a:xfrm>
+                    <a:prstGeom prst="rect"/>
+                  </pic:spPr>
+                </pic:pic>
+              </a:graphicData>
+            </a:graphic>
+          </wp:inline>
+        </w:drawing>
+      </w:r>
+    </w:p>
+    <w:p>
+      <w:pPr>
+        <w:spacing w:after="200"/>
+        <w:jc w:val="center"/>
       </w:pPr>
       <w:r>
         <w:rPr>
           <w:rFonts w:ascii="Times New Roman" w:hAnsi="Times New Roman"/>
           <w:b w:val="0"/>
-          <w:i w:val="0"/>
-          <w:sz w:val="24"/>
-        </w:rPr>
-        <w:t xml:space="preserve">→ Figur: </w:t>
-      </w:r>
-      <w:r>
-        <w:rPr>
-          <w:rFonts w:ascii="Courier New" w:hAnsi="Courier New"/>
-          <w:b w:val="0"/>
-          <w:i w:val="0"/>
+          <w:i/>
           <w:sz w:val="20"/>
         </w:rPr>
-        <w:t>005_report/figures/fig6_1_ukentlig_salg.png</w:t>
+        <w:t>Figur: `</w:t>
       </w:r>
     </w:p>
     <w:p>
@@ -5809,25 +5840,56 @@
     </w:p>
     <w:p>
       <w:pPr>
-        <w:spacing w:after="120"/>
+        <w:jc w:val="center"/>
+      </w:pPr>
+      <w:r>
+        <w:drawing>
+          <wp:inline xmlns:a="http://schemas.openxmlformats.org/drawingml/2006/main" xmlns:pic="http://schemas.openxmlformats.org/drawingml/2006/picture">
+            <wp:extent cx="5040000" cy="4607628"/>
+            <wp:docPr id="2" name="Picture 2"/>
+            <wp:cNvGraphicFramePr>
+              <a:graphicFrameLocks noChangeAspect="1"/>
+            </wp:cNvGraphicFramePr>
+            <a:graphic>
+              <a:graphicData uri="http://schemas.openxmlformats.org/drawingml/2006/picture">
+                <pic:pic>
+                  <pic:nvPicPr>
+                    <pic:cNvPr id="0" name="fig_acf_pacf.png"/>
+                    <pic:cNvPicPr/>
+                  </pic:nvPicPr>
+                  <pic:blipFill>
+                    <a:blip r:embed="rId10"/>
+                    <a:stretch>
+                      <a:fillRect/>
+                    </a:stretch>
+                  </pic:blipFill>
+                  <pic:spPr>
+                    <a:xfrm>
+                      <a:off x="0" y="0"/>
+                      <a:ext cx="5040000" cy="4607628"/>
+                    </a:xfrm>
+                    <a:prstGeom prst="rect"/>
+                  </pic:spPr>
+                </pic:pic>
+              </a:graphicData>
+            </a:graphic>
+          </wp:inline>
+        </w:drawing>
+      </w:r>
+    </w:p>
+    <w:p>
+      <w:pPr>
+        <w:spacing w:after="200"/>
+        <w:jc w:val="center"/>
       </w:pPr>
       <w:r>
         <w:rPr>
           <w:rFonts w:ascii="Times New Roman" w:hAnsi="Times New Roman"/>
           <w:b w:val="0"/>
-          <w:i w:val="0"/>
-          <w:sz w:val="24"/>
-        </w:rPr>
-        <w:t xml:space="preserve">→ Figur: </w:t>
-      </w:r>
-      <w:r>
-        <w:rPr>
-          <w:rFonts w:ascii="Courier New" w:hAnsi="Courier New"/>
-          <w:b w:val="0"/>
-          <w:i w:val="0"/>
+          <w:i/>
           <w:sz w:val="20"/>
         </w:rPr>
-        <w:t>005_report/figures/fig_acf_pacf.png</w:t>
+        <w:t>Figur: `</w:t>
       </w:r>
     </w:p>
     <w:p>
@@ -6324,25 +6386,56 @@
     </w:p>
     <w:p>
       <w:pPr>
-        <w:spacing w:after="120"/>
+        <w:jc w:val="center"/>
+      </w:pPr>
+      <w:r>
+        <w:drawing>
+          <wp:inline xmlns:a="http://schemas.openxmlformats.org/drawingml/2006/main" xmlns:pic="http://schemas.openxmlformats.org/drawingml/2006/picture">
+            <wp:extent cx="5040000" cy="2310326"/>
+            <wp:docPr id="3" name="Picture 3"/>
+            <wp:cNvGraphicFramePr>
+              <a:graphicFrameLocks noChangeAspect="1"/>
+            </wp:cNvGraphicFramePr>
+            <a:graphic>
+              <a:graphicData uri="http://schemas.openxmlformats.org/drawingml/2006/picture">
+                <pic:pic>
+                  <pic:nvPicPr>
+                    <pic:cNvPr id="0" name="fig_residual_acf.png"/>
+                    <pic:cNvPicPr/>
+                  </pic:nvPicPr>
+                  <pic:blipFill>
+                    <a:blip r:embed="rId11"/>
+                    <a:stretch>
+                      <a:fillRect/>
+                    </a:stretch>
+                  </pic:blipFill>
+                  <pic:spPr>
+                    <a:xfrm>
+                      <a:off x="0" y="0"/>
+                      <a:ext cx="5040000" cy="2310326"/>
+                    </a:xfrm>
+                    <a:prstGeom prst="rect"/>
+                  </pic:spPr>
+                </pic:pic>
+              </a:graphicData>
+            </a:graphic>
+          </wp:inline>
+        </w:drawing>
+      </w:r>
+    </w:p>
+    <w:p>
+      <w:pPr>
+        <w:spacing w:after="200"/>
+        <w:jc w:val="center"/>
       </w:pPr>
       <w:r>
         <w:rPr>
           <w:rFonts w:ascii="Times New Roman" w:hAnsi="Times New Roman"/>
           <w:b w:val="0"/>
-          <w:i w:val="0"/>
-          <w:sz w:val="24"/>
-        </w:rPr>
-        <w:t xml:space="preserve">→ Figur: </w:t>
-      </w:r>
-      <w:r>
-        <w:rPr>
-          <w:rFonts w:ascii="Courier New" w:hAnsi="Courier New"/>
-          <w:b w:val="0"/>
-          <w:i w:val="0"/>
+          <w:i/>
           <w:sz w:val="20"/>
         </w:rPr>
-        <w:t>005_report/figures/fig_residual_acf.png</w:t>
+        <w:t>Figur: `</w:t>
       </w:r>
     </w:p>
     <w:p>
@@ -7748,25 +7841,56 @@
     </w:p>
     <w:p>
       <w:pPr>
-        <w:spacing w:after="120"/>
+        <w:jc w:val="center"/>
+      </w:pPr>
+      <w:r>
+        <w:drawing>
+          <wp:inline xmlns:a="http://schemas.openxmlformats.org/drawingml/2006/main" xmlns:pic="http://schemas.openxmlformats.org/drawingml/2006/picture">
+            <wp:extent cx="5040000" cy="3213212"/>
+            <wp:docPr id="4" name="Picture 4"/>
+            <wp:cNvGraphicFramePr>
+              <a:graphicFrameLocks noChangeAspect="1"/>
+            </wp:cNvGraphicFramePr>
+            <a:graphic>
+              <a:graphicData uri="http://schemas.openxmlformats.org/drawingml/2006/picture">
+                <pic:pic>
+                  <pic:nvPicPr>
+                    <pic:cNvPr id="0" name="fig6_2_modellsammenlikning.png"/>
+                    <pic:cNvPicPr/>
+                  </pic:nvPicPr>
+                  <pic:blipFill>
+                    <a:blip r:embed="rId12"/>
+                    <a:stretch>
+                      <a:fillRect/>
+                    </a:stretch>
+                  </pic:blipFill>
+                  <pic:spPr>
+                    <a:xfrm>
+                      <a:off x="0" y="0"/>
+                      <a:ext cx="5040000" cy="3213212"/>
+                    </a:xfrm>
+                    <a:prstGeom prst="rect"/>
+                  </pic:spPr>
+                </pic:pic>
+              </a:graphicData>
+            </a:graphic>
+          </wp:inline>
+        </w:drawing>
+      </w:r>
+    </w:p>
+    <w:p>
+      <w:pPr>
+        <w:spacing w:after="200"/>
+        <w:jc w:val="center"/>
       </w:pPr>
       <w:r>
         <w:rPr>
           <w:rFonts w:ascii="Times New Roman" w:hAnsi="Times New Roman"/>
           <w:b w:val="0"/>
-          <w:i w:val="0"/>
-          <w:sz w:val="24"/>
-        </w:rPr>
-        <w:t xml:space="preserve">→ Figur: </w:t>
-      </w:r>
-      <w:r>
-        <w:rPr>
-          <w:rFonts w:ascii="Courier New" w:hAnsi="Courier New"/>
-          <w:b w:val="0"/>
-          <w:i w:val="0"/>
+          <w:i/>
           <w:sz w:val="20"/>
         </w:rPr>
-        <w:t>005_report/figures/fig6_2_modellsammenlikning.png</w:t>
+        <w:t>Figur: `</w:t>
       </w:r>
     </w:p>
     <w:p>
@@ -9029,25 +9153,56 @@
     </w:p>
     <w:p>
       <w:pPr>
-        <w:spacing w:after="120"/>
+        <w:jc w:val="center"/>
+      </w:pPr>
+      <w:r>
+        <w:drawing>
+          <wp:inline xmlns:a="http://schemas.openxmlformats.org/drawingml/2006/main" xmlns:pic="http://schemas.openxmlformats.org/drawingml/2006/picture">
+            <wp:extent cx="5040000" cy="3214755"/>
+            <wp:docPr id="5" name="Picture 5"/>
+            <wp:cNvGraphicFramePr>
+              <a:graphicFrameLocks noChangeAspect="1"/>
+            </wp:cNvGraphicFramePr>
+            <a:graphic>
+              <a:graphicData uri="http://schemas.openxmlformats.org/drawingml/2006/picture">
+                <pic:pic>
+                  <pic:nvPicPr>
+                    <pic:cNvPr id="0" name="fig6_3_lagersimulering.png"/>
+                    <pic:cNvPicPr/>
+                  </pic:nvPicPr>
+                  <pic:blipFill>
+                    <a:blip r:embed="rId13"/>
+                    <a:stretch>
+                      <a:fillRect/>
+                    </a:stretch>
+                  </pic:blipFill>
+                  <pic:spPr>
+                    <a:xfrm>
+                      <a:off x="0" y="0"/>
+                      <a:ext cx="5040000" cy="3214755"/>
+                    </a:xfrm>
+                    <a:prstGeom prst="rect"/>
+                  </pic:spPr>
+                </pic:pic>
+              </a:graphicData>
+            </a:graphic>
+          </wp:inline>
+        </w:drawing>
+      </w:r>
+    </w:p>
+    <w:p>
+      <w:pPr>
+        <w:spacing w:after="200"/>
+        <w:jc w:val="center"/>
       </w:pPr>
       <w:r>
         <w:rPr>
           <w:rFonts w:ascii="Times New Roman" w:hAnsi="Times New Roman"/>
           <w:b w:val="0"/>
-          <w:i w:val="0"/>
-          <w:sz w:val="24"/>
-        </w:rPr>
-        <w:t xml:space="preserve">→ Figur: </w:t>
-      </w:r>
-      <w:r>
-        <w:rPr>
-          <w:rFonts w:ascii="Courier New" w:hAnsi="Courier New"/>
-          <w:b w:val="0"/>
-          <w:i w:val="0"/>
+          <w:i/>
           <w:sz w:val="20"/>
         </w:rPr>
-        <w:t>005_report/figures/fig6_3_lagersimulering.png</w:t>
+        <w:t>Figur: `</w:t>
       </w:r>
     </w:p>
     <w:p>

</xml_diff>

<commit_message>
Fjern engelsk abstract og vedlegg fra rapport
- 00_sammendrag.md: beholder kun norsk sammendrag
- bygg_rapport_docx.py: genererer ikke lenger vedlegg (kap. 09)
- rapport.docx: oppdatert uten abstract og Python-kodevedlegg

Co-Authored-By: Claude Sonnet 4.6 <noreply@anthropic.com>
</commit_message>
<xml_diff>
--- a/rapport.docx
+++ b/rapport.docx
@@ -190,107 +190,6 @@
           <w:sz w:val="24"/>
         </w:rPr>
         <w:t xml:space="preserve"> etterspørselsprognoser, lagerstyring, SARIMA, Gradient Boosting, KI-støttet innkjøp, byggevarehandel</w:t>
-      </w:r>
-    </w:p>
-    <w:p>
-      <w:pPr>
-        <w:pBdr>
-          <w:bottom w:val="single" w:sz="6" w:space="1" w:color="AAAAAA"/>
-        </w:pBdr>
-        <w:spacing w:before="0" w:after="120"/>
-      </w:pPr>
-    </w:p>
-    <w:p>
-      <w:pPr>
-        <w:spacing w:before="0" w:after="240"/>
-      </w:pPr>
-      <w:r>
-        <w:rPr>
-          <w:rFonts w:ascii="Times New Roman" w:hAnsi="Times New Roman"/>
-          <w:b/>
-          <w:i w:val="0"/>
-          <w:sz w:val="32"/>
-        </w:rPr>
-        <w:t>Abstract</w:t>
-      </w:r>
-    </w:p>
-    <w:p>
-      <w:pPr>
-        <w:spacing w:after="120"/>
-      </w:pPr>
-      <w:r>
-        <w:rPr>
-          <w:rFonts w:ascii="Times New Roman" w:hAnsi="Times New Roman"/>
-          <w:b w:val="0"/>
-          <w:i w:val="0"/>
-          <w:sz w:val="24"/>
-        </w:rPr>
-        <w:t>This paper investigates how demand forecasting and artificial intelligence can improve inventory management for selected products at Byggmakker Gravdal, a Norwegian building materials retailer. The company currently relies on experience-based ordering and has repeatedly faced stockout situations for timber products during peak season.</w:t>
-      </w:r>
-    </w:p>
-    <w:p>
-      <w:pPr>
-        <w:spacing w:after="120"/>
-      </w:pPr>
-      <w:r>
-        <w:rPr>
-          <w:rFonts w:ascii="Times New Roman" w:hAnsi="Times New Roman"/>
-          <w:b w:val="0"/>
-          <w:i w:val="0"/>
-          <w:sz w:val="24"/>
-        </w:rPr>
-        <w:t>The analysis is based on weekly historical sales data from January 2024 to April 2026, covering four products: decking boards (28x120 mm), structural timber (48x98 mm), decking screws (4.2x55 mm), and wood screws (5x90 mm). Three forecasting models are compared: a naïve benchmark, SARIMA(1,1,1)(1,0,1)₁₃, and a Gradient Boosting Regressor, evaluated on a hold-out test set (November 2025 – April 2026) using RMSE, MAE, and MAPE.</w:t>
-      </w:r>
-    </w:p>
-    <w:p>
-      <w:pPr>
-        <w:spacing w:after="120"/>
-      </w:pPr>
-      <w:r>
-        <w:rPr>
-          <w:rFonts w:ascii="Times New Roman" w:hAnsi="Times New Roman"/>
-          <w:b w:val="0"/>
-          <w:i w:val="0"/>
-          <w:sz w:val="24"/>
-        </w:rPr>
-        <w:t>SARIMA achieves the lowest forecast error across all four products in the test period. Inventory parameters — safety stock, reorder point, and EOQ — are derived from the forecast results at a 95% service level. A simulation shows that an AI-supported ordering system (scenario B) substantially reduces stockouts compared to the experience-based approach (scenario A).</w:t>
-      </w:r>
-    </w:p>
-    <w:p>
-      <w:pPr>
-        <w:spacing w:after="120"/>
-      </w:pPr>
-      <w:r>
-        <w:rPr>
-          <w:rFonts w:ascii="Times New Roman" w:hAnsi="Times New Roman"/>
-          <w:b w:val="0"/>
-          <w:i w:val="0"/>
-          <w:sz w:val="24"/>
-        </w:rPr>
-        <w:t>The paper concludes that data-driven forecasting provides a significantly better basis for ordering decisions than current practice, and that an AI-supported procurement system can be implemented incrementally within Byggmakker Gravdal's existing ERP infrastructure.</w:t>
-      </w:r>
-    </w:p>
-    <w:p>
-      <w:pPr>
-        <w:spacing w:after="120"/>
-      </w:pPr>
-      <w:r>
-        <w:rPr>
-          <w:rFonts w:ascii="Times New Roman" w:hAnsi="Times New Roman"/>
-          <w:b/>
-          <w:i w:val="0"/>
-          <w:sz w:val="24"/>
-        </w:rPr>
-        <w:t>Keywords:</w:t>
-      </w:r>
-      <w:r>
-        <w:rPr>
-          <w:rFonts w:ascii="Times New Roman" w:hAnsi="Times New Roman"/>
-          <w:b w:val="0"/>
-          <w:i w:val="0"/>
-          <w:sz w:val="24"/>
-        </w:rPr>
-        <w:t xml:space="preserve"> demand forecasting, inventory management, SARIMA, Gradient Boosting, AI-supported procurement, building materials retail</w:t>
       </w:r>
     </w:p>
     <w:p>
@@ -10303,1125 +10202,6 @@
         <w:t>(2), 354–366.</w:t>
       </w:r>
     </w:p>
-    <w:p>
-      <w:r>
-        <w:br w:type="page"/>
-      </w:r>
-    </w:p>
-    <w:p>
-      <w:pPr>
-        <w:pStyle w:val="Heading1"/>
-      </w:pPr>
-      <w:r>
-        <w:rPr>
-          <w:rFonts w:ascii="Times New Roman" w:hAnsi="Times New Roman"/>
-          <w:b/>
-          <w:i w:val="0"/>
-          <w:sz w:val="32"/>
-        </w:rPr>
-        <w:t>Vedlegg – Python-kode</w:t>
-      </w:r>
-    </w:p>
-    <w:p>
-      <w:pPr>
-        <w:spacing w:after="120"/>
-      </w:pPr>
-      <w:r>
-        <w:rPr>
-          <w:rFonts w:ascii="Times New Roman" w:hAnsi="Times New Roman"/>
-          <w:b w:val="0"/>
-          <w:i w:val="0"/>
-          <w:sz w:val="24"/>
-        </w:rPr>
-        <w:t xml:space="preserve">Alle analyser er gjennomført i Python 3. Koden kjøres fra prosjektets rotmappe med kommandoen </w:t>
-      </w:r>
-      <w:r>
-        <w:rPr>
-          <w:rFonts w:ascii="Courier New" w:hAnsi="Courier New"/>
-          <w:b w:val="0"/>
-          <w:i w:val="0"/>
-          <w:sz w:val="20"/>
-        </w:rPr>
-        <w:t>python 004_scripts/kjor_alt.py</w:t>
-      </w:r>
-      <w:r>
-        <w:rPr>
-          <w:rFonts w:ascii="Times New Roman" w:hAnsi="Times New Roman"/>
-          <w:b w:val="0"/>
-          <w:i w:val="0"/>
-          <w:sz w:val="24"/>
-        </w:rPr>
-        <w:t xml:space="preserve">. Avhengigheter er spesifisert i </w:t>
-      </w:r>
-      <w:r>
-        <w:rPr>
-          <w:rFonts w:ascii="Courier New" w:hAnsi="Courier New"/>
-          <w:b w:val="0"/>
-          <w:i w:val="0"/>
-          <w:sz w:val="20"/>
-        </w:rPr>
-        <w:t>requirements.txt</w:t>
-      </w:r>
-      <w:r>
-        <w:rPr>
-          <w:rFonts w:ascii="Times New Roman" w:hAnsi="Times New Roman"/>
-          <w:b w:val="0"/>
-          <w:i w:val="0"/>
-          <w:sz w:val="24"/>
-        </w:rPr>
-        <w:t>.</w:t>
-      </w:r>
-    </w:p>
-    <w:p>
-      <w:pPr>
-        <w:pBdr>
-          <w:bottom w:val="single" w:sz="6" w:space="1" w:color="AAAAAA"/>
-        </w:pBdr>
-        <w:spacing w:before="0" w:after="120"/>
-      </w:pPr>
-    </w:p>
-    <w:p>
-      <w:pPr>
-        <w:pStyle w:val="Heading2"/>
-        <w:spacing w:before="240" w:after="80"/>
-      </w:pPr>
-      <w:r>
-        <w:rPr>
-          <w:rFonts w:ascii="Times New Roman" w:hAnsi="Times New Roman"/>
-          <w:b/>
-          <w:i w:val="0"/>
-          <w:sz w:val="26"/>
-        </w:rPr>
-        <w:t>Vedlegg A – Datainnlasting og rensing (`01_last_inn_data.py`)</w:t>
-      </w:r>
-    </w:p>
-    <w:p>
-      <w:pPr>
-        <w:spacing w:after="120" w:before="120"/>
-        <w:ind w:left="567"/>
-        <w:shd w:val="clear" w:color="auto" w:fill="F2F2F2"/>
-      </w:pPr>
-      <w:r>
-        <w:rPr>
-          <w:rFonts w:ascii="Courier New" w:hAnsi="Courier New"/>
-          <w:b w:val="0"/>
-          <w:i w:val="0"/>
-          <w:sz w:val="18"/>
-        </w:rPr>
-        <w:t>"""</w:t>
-        <w:br/>
-        <w:t>Steg 1: Last inn og rens salgsdata fra ERP-eksport (Byggmakker Gravdal).</w:t>
-        <w:br/>
-        <w:br/>
-        <w:t>Filformat (Customreport):</w:t>
-        <w:br/>
-        <w:t xml:space="preserve">  - Rad 0–7:  metadata/header</w:t>
-        <w:br/>
-        <w:t xml:space="preserve">  - Kolonne 0: YYYYWW-ukenummer (f.eks. 202401 = 2024 uke 1)</w:t>
-        <w:br/>
-        <w:t xml:space="preserve">  - Kolonnerekkefølge per produkt: Quantity | Cost price | kostpris pr enhet</w:t>
-        <w:br/>
-        <w:t xml:space="preserve">    Produkt 1 (Terrassebord): kol 1–3</w:t>
-        <w:br/>
-        <w:t xml:space="preserve">    Produkt 2 (Planke):       kol 4–6</w:t>
-        <w:br/>
-        <w:t xml:space="preserve">    Produkt 3 (Terrasseskrue): kol 7–9</w:t>
-        <w:br/>
-        <w:t xml:space="preserve">    Produkt 4 (Skrue5x90):    kol 10–12</w:t>
-        <w:br/>
-        <w:t>"""</w:t>
-        <w:br/>
-        <w:br/>
-        <w:t>import pandas as pd</w:t>
-        <w:br/>
-        <w:t>import numpy as np</w:t>
-        <w:br/>
-        <w:t>from pathlib import Path</w:t>
-        <w:br/>
-        <w:br/>
-        <w:t>ROOT = Path(__file__).parent.parent</w:t>
-        <w:br/>
-        <w:t>RAW  = ROOT / "002_data" / "raw"</w:t>
-        <w:br/>
-        <w:t>PROC = ROOT / "002_data" / "processed"</w:t>
-        <w:br/>
-        <w:t>PROC.mkdir(exist_ok=True)</w:t>
-        <w:br/>
-        <w:br/>
-        <w:t>EXCEL_FIL    = RAW / "salgsrapport Oskar v2.xlsx"</w:t>
-        <w:br/>
-        <w:t>HEADER_RADER = 8</w:t>
-        <w:br/>
-        <w:br/>
-        <w:t>PRODUKT_KOLONNER = {</w:t>
-        <w:br/>
-        <w:t xml:space="preserve">    "Terrassebord": 1,</w:t>
-        <w:br/>
-        <w:t xml:space="preserve">    "Planke":       4,</w:t>
-        <w:br/>
-        <w:t xml:space="preserve">    "Terrasseskrue": 7,</w:t>
-        <w:br/>
-        <w:t xml:space="preserve">    "Skrue5x90":    10,</w:t>
-        <w:br/>
-        <w:t>}</w:t>
-        <w:br/>
-        <w:br/>
-        <w:br/>
-        <w:t>def uke_til_dato(yyyyww: int) -&gt; pd.Timestamp:</w:t>
-        <w:br/>
-        <w:t xml:space="preserve">    s = str(int(yyyyww))</w:t>
-        <w:br/>
-        <w:t xml:space="preserve">    return pd.Timestamp.fromisocalendar(int(s[:4]), int(s[4:]), 1)</w:t>
-        <w:br/>
-        <w:br/>
-        <w:br/>
-        <w:t>def main():</w:t>
-        <w:br/>
-        <w:t xml:space="preserve">    xl   = pd.read_excel(EXCEL_FIL, header=None)</w:t>
-        <w:br/>
-        <w:t xml:space="preserve">    data = xl.iloc[HEADER_RADER:].reset_index(drop=True)</w:t>
-        <w:br/>
-        <w:t xml:space="preserve">    data[0] = data[0].astype(str).str.strip()</w:t>
-        <w:br/>
-        <w:t xml:space="preserve">    dato = data[0].apply(</w:t>
-        <w:br/>
-        <w:t xml:space="preserve">        lambda x: uke_til_dato(x) if x.replace('.', '').isdigit() else pd.NaT</w:t>
-        <w:br/>
-        <w:t xml:space="preserve">    )</w:t>
-        <w:br/>
-        <w:t xml:space="preserve">    df = pd.DataFrame({"Dato": dato})</w:t>
-        <w:br/>
-        <w:t xml:space="preserve">    for namn, kol in PRODUKT_KOLONNER.items():</w:t>
-        <w:br/>
-        <w:t xml:space="preserve">        serie = data[kol].replace("-", np.nan).astype(float)</w:t>
-        <w:br/>
-        <w:t xml:space="preserve">        df[namn] = serie.clip(lower=0).fillna(0).values</w:t>
-        <w:br/>
-        <w:t xml:space="preserve">    df = df.dropna(subset=["Dato"]).set_index("Dato").sort_index()</w:t>
-        <w:br/>
-        <w:t xml:space="preserve">    df = df.loc["2024-01-01":"2026-04-30"]</w:t>
-        <w:br/>
-        <w:t xml:space="preserve">    df.to_csv(PROC / "ukentlig_salg.csv")</w:t>
-        <w:br/>
-        <w:br/>
-        <w:br/>
-        <w:t>if __name__ == "__main__":</w:t>
-        <w:br/>
-        <w:t xml:space="preserve">    main()</w:t>
-      </w:r>
-    </w:p>
-    <w:p>
-      <w:pPr>
-        <w:pBdr>
-          <w:bottom w:val="single" w:sz="6" w:space="1" w:color="AAAAAA"/>
-        </w:pBdr>
-        <w:spacing w:before="0" w:after="120"/>
-      </w:pPr>
-    </w:p>
-    <w:p>
-      <w:pPr>
-        <w:pStyle w:val="Heading2"/>
-        <w:spacing w:before="240" w:after="80"/>
-      </w:pPr>
-      <w:r>
-        <w:rPr>
-          <w:rFonts w:ascii="Times New Roman" w:hAnsi="Times New Roman"/>
-          <w:b/>
-          <w:i w:val="0"/>
-          <w:sz w:val="26"/>
-        </w:rPr>
-        <w:t>Vedlegg B – Deskriptiv analyse (`02_deskriptiv_analyse.py`)</w:t>
-      </w:r>
-    </w:p>
-    <w:p>
-      <w:pPr>
-        <w:spacing w:after="120" w:before="120"/>
-        <w:ind w:left="567"/>
-        <w:shd w:val="clear" w:color="auto" w:fill="F2F2F2"/>
-      </w:pPr>
-      <w:r>
-        <w:rPr>
-          <w:rFonts w:ascii="Courier New" w:hAnsi="Courier New"/>
-          <w:b w:val="0"/>
-          <w:i w:val="0"/>
-          <w:sz w:val="18"/>
-        </w:rPr>
-        <w:t>import pandas as pd</w:t>
-        <w:br/>
-        <w:t>import numpy as np</w:t>
-        <w:br/>
-        <w:t>import matplotlib.pyplot as plt</w:t>
-        <w:br/>
-        <w:t>import matplotlib.dates as mdates</w:t>
-        <w:br/>
-        <w:t>from pathlib import Path</w:t>
-        <w:br/>
-        <w:br/>
-        <w:t>ROOT    = Path(__file__).parent.parent</w:t>
-        <w:br/>
-        <w:t>PROC    = ROOT / "002_data" / "processed"</w:t>
-        <w:br/>
-        <w:t>FIGURER = ROOT / "005_report" / "figures"</w:t>
-        <w:br/>
-        <w:br/>
-        <w:t>VISNINGSNAVN = {</w:t>
-        <w:br/>
-        <w:t xml:space="preserve">    "Terrassebord":  "Terrassebord (28x120)",</w:t>
-        <w:br/>
-        <w:t xml:space="preserve">    "Planke":        "Planke (48x98)",</w:t>
-        <w:br/>
-        <w:t xml:space="preserve">    "Terrasseskrue": "Terrasseskrue (4,2x55)",</w:t>
-        <w:br/>
-        <w:t xml:space="preserve">    "Skrue5x90":     "Skrue 5x90",</w:t>
-        <w:br/>
-        <w:t>}</w:t>
-        <w:br/>
-        <w:br/>
-        <w:br/>
-        <w:t>def deskriptiv_tabell(df):</w:t>
-        <w:br/>
-        <w:t xml:space="preserve">    rader = []</w:t>
-        <w:br/>
-        <w:t xml:space="preserve">    for kol in df.columns:</w:t>
-        <w:br/>
-        <w:t xml:space="preserve">        s = df[kol]</w:t>
-        <w:br/>
-        <w:t xml:space="preserve">        rader.append({</w:t>
-        <w:br/>
-        <w:t xml:space="preserve">            "Produkt": VISNINGSNAVN.get(kol, kol),</w:t>
-        <w:br/>
-        <w:t xml:space="preserve">            "N": len(s), "Snitt": round(s.mean(), 1),</w:t>
-        <w:br/>
-        <w:t xml:space="preserve">            "Std": round(s.std(), 1), "Min": round(s.min(), 1),</w:t>
-        <w:br/>
-        <w:t xml:space="preserve">            "Q1": round(s.quantile(0.25), 1), "Median": round(s.median(), 1),</w:t>
-        <w:br/>
-        <w:t xml:space="preserve">            "Q3": round(s.quantile(0.75), 1), "Maks": round(s.max(), 1),</w:t>
-        <w:br/>
-        <w:t xml:space="preserve">            "CV%": f"{round(s.std() / s.mean() * 100)}%",</w:t>
-        <w:br/>
-        <w:t xml:space="preserve">        })</w:t>
-        <w:br/>
-        <w:t xml:space="preserve">    return pd.DataFrame(rader)</w:t>
-        <w:br/>
-        <w:br/>
-        <w:br/>
-        <w:t>def main():</w:t>
-        <w:br/>
-        <w:t xml:space="preserve">    df = pd.read_csv(PROC / "ukentlig_salg.csv", index_col=0, parse_dates=True)</w:t>
-        <w:br/>
-        <w:t xml:space="preserve">    tabell = deskriptiv_tabell(df)</w:t>
-        <w:br/>
-        <w:t xml:space="preserve">    tabell.to_csv(PROC / "tabell_6_1_deskriptiv.csv", index=False)</w:t>
-        <w:br/>
-        <w:br/>
-        <w:t xml:space="preserve">    fig, axes = plt.subplots(2, 2, figsize=(14, 8))</w:t>
-        <w:br/>
-        <w:t xml:space="preserve">    fig.suptitle("Figur 6.1 – Ukentlig salg per produkt med trendlinje", fontsize=13)</w:t>
-        <w:br/>
-        <w:t xml:space="preserve">    for i, kol in enumerate(df.columns):</w:t>
-        <w:br/>
-        <w:t xml:space="preserve">        ax = axes.flatten()[i]</w:t>
-        <w:br/>
-        <w:t xml:space="preserve">        s  = df[kol]</w:t>
-        <w:br/>
-        <w:t xml:space="preserve">        ax.plot(s.index, s.values, linewidth=0.9, label="Ukentlig salg")</w:t>
-        <w:br/>
-        <w:t xml:space="preserve">        ax.plot(s.index, s.rolling(4).mean(), linestyle="--", label="4-ukers snitt")</w:t>
-        <w:br/>
-        <w:t xml:space="preserve">        x = np.arange(len(s))</w:t>
-        <w:br/>
-        <w:t xml:space="preserve">        ax.plot(s.index, np.poly1d(np.polyfit(x, s.values, 1))(x),</w:t>
-        <w:br/>
-        <w:t xml:space="preserve">                linestyle="-.", color="red", label="Trend")</w:t>
-        <w:br/>
-        <w:t xml:space="preserve">        ax.set_title(VISNINGSNAVN.get(kol, kol), fontsize=10)</w:t>
-        <w:br/>
-        <w:t xml:space="preserve">        ax.xaxis.set_major_formatter(mdates.DateFormatter("%b\n%Y"))</w:t>
-        <w:br/>
-        <w:t xml:space="preserve">        ax.legend(fontsize=7)</w:t>
-        <w:br/>
-        <w:t xml:space="preserve">    plt.tight_layout()</w:t>
-        <w:br/>
-        <w:t xml:space="preserve">    plt.savefig(FIGURER / "fig6_1_ukentlig_salg.png", dpi=150, bbox_inches="tight")</w:t>
-        <w:br/>
-        <w:t xml:space="preserve">    plt.close()</w:t>
-        <w:br/>
-        <w:br/>
-        <w:br/>
-        <w:t>if __name__ == "__main__":</w:t>
-        <w:br/>
-        <w:t xml:space="preserve">    main()</w:t>
-      </w:r>
-    </w:p>
-    <w:p>
-      <w:pPr>
-        <w:pBdr>
-          <w:bottom w:val="single" w:sz="6" w:space="1" w:color="AAAAAA"/>
-        </w:pBdr>
-        <w:spacing w:before="0" w:after="120"/>
-      </w:pPr>
-    </w:p>
-    <w:p>
-      <w:pPr>
-        <w:pStyle w:val="Heading2"/>
-        <w:spacing w:before="240" w:after="80"/>
-      </w:pPr>
-      <w:r>
-        <w:rPr>
-          <w:rFonts w:ascii="Times New Roman" w:hAnsi="Times New Roman"/>
-          <w:b/>
-          <w:i w:val="0"/>
-          <w:sz w:val="26"/>
-        </w:rPr>
-        <w:t>Vedlegg C – Stasjonaritetstest og ACF/PACF (`03_stasjonaritet_acf_pacf.py`)</w:t>
-      </w:r>
-    </w:p>
-    <w:p>
-      <w:pPr>
-        <w:spacing w:after="120" w:before="120"/>
-        <w:ind w:left="567"/>
-        <w:shd w:val="clear" w:color="auto" w:fill="F2F2F2"/>
-      </w:pPr>
-      <w:r>
-        <w:rPr>
-          <w:rFonts w:ascii="Courier New" w:hAnsi="Courier New"/>
-          <w:b w:val="0"/>
-          <w:i w:val="0"/>
-          <w:sz w:val="18"/>
-        </w:rPr>
-        <w:t>import pandas as pd</w:t>
-        <w:br/>
-        <w:t>import numpy as np</w:t>
-        <w:br/>
-        <w:t>import matplotlib.pyplot as plt</w:t>
-        <w:br/>
-        <w:t>from pathlib import Path</w:t>
-        <w:br/>
-        <w:t>from statsmodels.tsa.stattools import adfuller</w:t>
-        <w:br/>
-        <w:t>from statsmodels.graphics.tsaplots import plot_acf, plot_pacf</w:t>
-        <w:br/>
-        <w:br/>
-        <w:t>ROOT    = Path(__file__).parent.parent</w:t>
-        <w:br/>
-        <w:t>PROC    = ROOT / "002_data" / "processed"</w:t>
-        <w:br/>
-        <w:t>FIGURER = ROOT / "005_report" / "figures"</w:t>
-        <w:br/>
-        <w:br/>
-        <w:t>VISNINGSNAVN = {</w:t>
-        <w:br/>
-        <w:t xml:space="preserve">    "Terrassebord":  "Terrassebord (28x120)",  "Planke": "Planke (48x98)",</w:t>
-        <w:br/>
-        <w:t xml:space="preserve">    "Terrasseskrue": "Terrasseskrue (4,2x55)", "Skrue5x90": "Skrue 5x90",</w:t>
-        <w:br/>
-        <w:t>}</w:t>
-        <w:br/>
-        <w:br/>
-        <w:br/>
-        <w:t>def kjor_adf(serie, navn):</w:t>
-        <w:br/>
-        <w:t xml:space="preserve">    s_pos = serie.replace(0, 0.01)</w:t>
-        <w:br/>
-        <w:t xml:space="preserve">    resultater = []</w:t>
-        <w:br/>
-        <w:t xml:space="preserve">    for label, s in [("Original", serie),</w:t>
-        <w:br/>
-        <w:t xml:space="preserve">                     ("Log + diff (d=1)", np.log(s_pos).diff().dropna())]:</w:t>
-        <w:br/>
-        <w:t xml:space="preserve">        res = adfuller(s, autolag="AIC")</w:t>
-        <w:br/>
-        <w:t xml:space="preserve">        resultater.append({</w:t>
-        <w:br/>
-        <w:t xml:space="preserve">            "Produkt": VISNINGSNAVN.get(navn, navn), "Serie": label,</w:t>
-        <w:br/>
-        <w:t xml:space="preserve">            "ADF-stat": round(res[0], 3), "p-verdi": round(res[1], 4),</w:t>
-        <w:br/>
-        <w:t xml:space="preserve">            "Krit. 5%": round(res[4]["5%"], 3),</w:t>
-        <w:br/>
-        <w:t xml:space="preserve">            "Stasjonær": "✓" if res[1] &lt; 0.05 else "✗",</w:t>
-        <w:br/>
-        <w:t xml:space="preserve">        })</w:t>
-        <w:br/>
-        <w:t xml:space="preserve">    return resultater</w:t>
-        <w:br/>
-        <w:br/>
-        <w:br/>
-        <w:t>def main():</w:t>
-        <w:br/>
-        <w:t xml:space="preserve">    df = pd.read_csv(PROC / "ukentlig_salg.csv", index_col=0, parse_dates=True)</w:t>
-        <w:br/>
-        <w:t xml:space="preserve">    alle = []</w:t>
-        <w:br/>
-        <w:t xml:space="preserve">    for kol in df.columns:</w:t>
-        <w:br/>
-        <w:t xml:space="preserve">        alle.extend(kjor_adf(df[kol], kol))</w:t>
-        <w:br/>
-        <w:t xml:space="preserve">    pd.DataFrame(alle).to_csv(PROC / "adf_resultater.csv", index=False)</w:t>
-        <w:br/>
-        <w:br/>
-        <w:t xml:space="preserve">    fig, axes = plt.subplots(len(df.columns), 2, figsize=(13, 12))</w:t>
-        <w:br/>
-        <w:t xml:space="preserve">    for i, kol in enumerate(df.columns):</w:t>
-        <w:br/>
-        <w:t xml:space="preserve">        s_diff = np.log(df[kol].replace(0, 0.01)).diff().dropna()</w:t>
-        <w:br/>
-        <w:t xml:space="preserve">        plot_acf(s_diff, ax=axes[i, 0], lags=26, zero=False,</w:t>
-        <w:br/>
-        <w:t xml:space="preserve">                 title=f"ACF – {VISNINGSNAVN.get(kol, kol)}")</w:t>
-        <w:br/>
-        <w:t xml:space="preserve">        plot_pacf(s_diff, ax=axes[i, 1], lags=26, zero=False, method="ywm",</w:t>
-        <w:br/>
-        <w:t xml:space="preserve">                  title=f"PACF – {VISNINGSNAVN.get(kol, kol)}")</w:t>
-        <w:br/>
-        <w:t xml:space="preserve">        for ax in axes[i]:</w:t>
-        <w:br/>
-        <w:t xml:space="preserve">            for lag in [13, 26]:</w:t>
-        <w:br/>
-        <w:t xml:space="preserve">                ax.axvline(lag, color="red", linestyle="--", linewidth=0.8)</w:t>
-        <w:br/>
-        <w:t xml:space="preserve">    plt.tight_layout()</w:t>
-        <w:br/>
-        <w:t xml:space="preserve">    plt.savefig(FIGURER / "fig_acf_pacf.png", dpi=150, bbox_inches="tight")</w:t>
-        <w:br/>
-        <w:t xml:space="preserve">    plt.close()</w:t>
-        <w:br/>
-        <w:br/>
-        <w:br/>
-        <w:t>if __name__ == "__main__":</w:t>
-        <w:br/>
-        <w:t xml:space="preserve">    main()</w:t>
-      </w:r>
-    </w:p>
-    <w:p>
-      <w:pPr>
-        <w:pBdr>
-          <w:bottom w:val="single" w:sz="6" w:space="1" w:color="AAAAAA"/>
-        </w:pBdr>
-        <w:spacing w:before="0" w:after="120"/>
-      </w:pPr>
-    </w:p>
-    <w:p>
-      <w:pPr>
-        <w:pStyle w:val="Heading2"/>
-        <w:spacing w:before="240" w:after="80"/>
-      </w:pPr>
-      <w:r>
-        <w:rPr>
-          <w:rFonts w:ascii="Times New Roman" w:hAnsi="Times New Roman"/>
-          <w:b/>
-          <w:i w:val="0"/>
-          <w:sz w:val="26"/>
-        </w:rPr>
-        <w:t>Vedlegg D – SARIMA-modellering (`04_sarima.py`)</w:t>
-      </w:r>
-    </w:p>
-    <w:p>
-      <w:pPr>
-        <w:spacing w:after="120" w:before="120"/>
-        <w:ind w:left="567"/>
-        <w:shd w:val="clear" w:color="auto" w:fill="F2F2F2"/>
-      </w:pPr>
-      <w:r>
-        <w:rPr>
-          <w:rFonts w:ascii="Courier New" w:hAnsi="Courier New"/>
-          <w:b w:val="0"/>
-          <w:i w:val="0"/>
-          <w:sz w:val="18"/>
-        </w:rPr>
-        <w:t>import warnings</w:t>
-        <w:br/>
-        <w:t>import pandas as pd</w:t>
-        <w:br/>
-        <w:t>import numpy as np</w:t>
-        <w:br/>
-        <w:t>import matplotlib.pyplot as plt</w:t>
-        <w:br/>
-        <w:t>from pathlib import Path</w:t>
-        <w:br/>
-        <w:t>from statsmodels.tsa.statespace.sarimax import SARIMAX</w:t>
-        <w:br/>
-        <w:t>from statsmodels.stats.diagnostic import acorr_ljungbox</w:t>
-        <w:br/>
-        <w:t>from statsmodels.graphics.tsaplots import plot_acf</w:t>
-        <w:br/>
-        <w:br/>
-        <w:t>warnings.filterwarnings("ignore")</w:t>
-        <w:br/>
-        <w:br/>
-        <w:t>ROOT    = Path(__file__).parent.parent</w:t>
-        <w:br/>
-        <w:t>PROC    = ROOT / "002_data" / "processed"</w:t>
-        <w:br/>
-        <w:t>FIGURER = ROOT / "005_report" / "figures"</w:t>
-        <w:br/>
-        <w:br/>
-        <w:t>ORDER      = (1, 1, 1)</w:t>
-        <w:br/>
-        <w:t>SEASONAL   = (1, 0, 1, 13)</w:t>
-        <w:br/>
-        <w:t>TRAIN_FRAC = 0.80</w:t>
-        <w:br/>
-        <w:br/>
-        <w:t>VISNINGSNAVN = {</w:t>
-        <w:br/>
-        <w:t xml:space="preserve">    "Terrassebord":  "Terrassebord (28x120)",  "Planke": "Planke (48x98)",</w:t>
-        <w:br/>
-        <w:t xml:space="preserve">    "Terrasseskrue": "Terrasseskrue (4,2x55)", "Skrue5x90": "Skrue 5x90",</w:t>
-        <w:br/>
-        <w:t>}</w:t>
-        <w:br/>
-        <w:br/>
-        <w:br/>
-        <w:t>def main():</w:t>
-        <w:br/>
-        <w:t xml:space="preserve">    df = pd.read_csv(PROC / "ukentlig_salg.csv", index_col=0, parse_dates=True)</w:t>
-        <w:br/>
-        <w:t xml:space="preserve">    resultater, modell_tabell, prognoser = {}, [], {}</w:t>
-        <w:br/>
-        <w:br/>
-        <w:t xml:space="preserve">    for kol in df.columns:</w:t>
-        <w:br/>
-        <w:t xml:space="preserve">        serie  = df[kol]</w:t>
-        <w:br/>
-        <w:t xml:space="preserve">        n_tren = int(len(serie) * TRAIN_FRAC)</w:t>
-        <w:br/>
-        <w:t xml:space="preserve">        s_log  = np.log(serie.replace(0, 0.01))</w:t>
-        <w:br/>
-        <w:t xml:space="preserve">        modell = SARIMAX(s_log.iloc[:n_tren], order=ORDER, seasonal_order=SEASONAL,</w:t>
-        <w:br/>
-        <w:t xml:space="preserve">                         enforce_stationarity=False, enforce_invertibility=False)</w:t>
-        <w:br/>
-        <w:t xml:space="preserve">        res = modell.fit(disp=False)</w:t>
-        <w:br/>
-        <w:t xml:space="preserve">        resultater[kol] = res</w:t>
-        <w:br/>
-        <w:t xml:space="preserve">        modell_tabell.append({</w:t>
-        <w:br/>
-        <w:t xml:space="preserve">            "Produkt": VISNINGSNAVN.get(kol, kol),</w:t>
-        <w:br/>
-        <w:t xml:space="preserve">            "AIC": round(res.aic, 1), "BIC": round(res.bic, 1),</w:t>
-        <w:br/>
-        <w:t xml:space="preserve">            "Log-likelihood": round(res.llf, 1),</w:t>
-        <w:br/>
-        <w:t xml:space="preserve">        })</w:t>
-        <w:br/>
-        <w:t xml:space="preserve">        n_test     = len(serie) - n_tren</w:t>
-        <w:br/>
-        <w:t xml:space="preserve">        test_index = serie.index[n_tren:]</w:t>
-        <w:br/>
-        <w:t xml:space="preserve">        prognoser[kol] = pd.Series(</w:t>
-        <w:br/>
-        <w:t xml:space="preserve">            np.exp(res.forecast(steps=n_test).values), index=test_index, name=kol</w:t>
-        <w:br/>
-        <w:t xml:space="preserve">        )</w:t>
-        <w:br/>
-        <w:br/>
-        <w:t xml:space="preserve">    pd.DataFrame(modell_tabell).to_csv(PROC / "sarima_modell_tabell.csv", index=False)</w:t>
-        <w:br/>
-        <w:br/>
-        <w:t xml:space="preserve">    lb_rader = []</w:t>
-        <w:br/>
-        <w:t xml:space="preserve">    for navn, res in resultater.items():</w:t>
-        <w:br/>
-        <w:t xml:space="preserve">        for lag in [13, 26]:</w:t>
-        <w:br/>
-        <w:t xml:space="preserve">            lb = acorr_ljungbox(res.resid, lags=[lag], return_df=True)</w:t>
-        <w:br/>
-        <w:t xml:space="preserve">            p  = float(lb["lb_pvalue"].iloc[0])</w:t>
-        <w:br/>
-        <w:t xml:space="preserve">            lb_rader.append({</w:t>
-        <w:br/>
-        <w:t xml:space="preserve">                "Produkt": VISNINGSNAVN.get(navn, navn), "Lag": lag,</w:t>
-        <w:br/>
-        <w:t xml:space="preserve">                "Q-stat": round(float(lb["lb_stat"].iloc[0]), 2),</w:t>
-        <w:br/>
-        <w:t xml:space="preserve">                "p-verdi": round(p, 4),</w:t>
-        <w:br/>
-        <w:t xml:space="preserve">                "Konklusjon": "Ingen autokorrelasjon ✓" if p &gt; 0.05</w:t>
-        <w:br/>
-        <w:t xml:space="preserve">                              else "Signifikant autokorrelasjon",</w:t>
-        <w:br/>
-        <w:t xml:space="preserve">            })</w:t>
-        <w:br/>
-        <w:t xml:space="preserve">    pd.DataFrame(lb_rader).to_csv(PROC / "ljung_box.csv", index=False)</w:t>
-        <w:br/>
-        <w:t xml:space="preserve">    pd.DataFrame(prognoser).to_csv(PROC / "sarima_prognoser.csv")</w:t>
-        <w:br/>
-        <w:br/>
-        <w:br/>
-        <w:t>if __name__ == "__main__":</w:t>
-        <w:br/>
-        <w:t xml:space="preserve">    main()</w:t>
-      </w:r>
-    </w:p>
-    <w:p>
-      <w:pPr>
-        <w:pBdr>
-          <w:bottom w:val="single" w:sz="6" w:space="1" w:color="AAAAAA"/>
-        </w:pBdr>
-        <w:spacing w:before="0" w:after="120"/>
-      </w:pPr>
-    </w:p>
-    <w:p>
-      <w:pPr>
-        <w:pStyle w:val="Heading2"/>
-        <w:spacing w:before="240" w:after="80"/>
-      </w:pPr>
-      <w:r>
-        <w:rPr>
-          <w:rFonts w:ascii="Times New Roman" w:hAnsi="Times New Roman"/>
-          <w:b/>
-          <w:i w:val="0"/>
-          <w:sz w:val="26"/>
-        </w:rPr>
-        <w:t>Vedlegg E – Gradient Boosting (`05_gradient_boosting.py`)</w:t>
-      </w:r>
-    </w:p>
-    <w:p>
-      <w:pPr>
-        <w:spacing w:after="120" w:before="120"/>
-        <w:ind w:left="567"/>
-        <w:shd w:val="clear" w:color="auto" w:fill="F2F2F2"/>
-      </w:pPr>
-      <w:r>
-        <w:rPr>
-          <w:rFonts w:ascii="Courier New" w:hAnsi="Courier New"/>
-          <w:b w:val="0"/>
-          <w:i w:val="0"/>
-          <w:sz w:val="18"/>
-        </w:rPr>
-        <w:t>import pandas as pd</w:t>
-        <w:br/>
-        <w:t>import numpy as np</w:t>
-        <w:br/>
-        <w:t>from pathlib import Path</w:t>
-        <w:br/>
-        <w:t>from sklearn.ensemble import GradientBoostingRegressor</w:t>
-        <w:br/>
-        <w:t>from sklearn.metrics import mean_squared_error, mean_absolute_error</w:t>
-        <w:br/>
-        <w:br/>
-        <w:t>ROOT = Path(__file__).parent.parent</w:t>
-        <w:br/>
-        <w:t>PROC = ROOT / "002_data" / "processed"</w:t>
-        <w:br/>
-        <w:br/>
-        <w:t>GB_PARAMS  = dict(n_estimators=200, learning_rate=0.05, max_depth=3, random_state=42)</w:t>
-        <w:br/>
-        <w:t>TRAIN_FRAC = 0.80</w:t>
-        <w:br/>
-        <w:br/>
-        <w:t>VISNINGSNAVN = {</w:t>
-        <w:br/>
-        <w:t xml:space="preserve">    "Terrassebord":  "Terrassebord (28x120)",  "Planke": "Planke (48x98)",</w:t>
-        <w:br/>
-        <w:t xml:space="preserve">    "Terrasseskrue": "Terrasseskrue (4,2x55)", "Skrue5x90": "Skrue 5x90",</w:t>
-        <w:br/>
-        <w:t>}</w:t>
-        <w:br/>
-        <w:br/>
-        <w:br/>
-        <w:t>def lag_features(serie):</w:t>
-        <w:br/>
-        <w:t xml:space="preserve">    df = pd.DataFrame({"y": serie.values}, index=serie.index)</w:t>
-        <w:br/>
-        <w:t xml:space="preserve">    for lag in range(1, 9):</w:t>
-        <w:br/>
-        <w:t xml:space="preserve">        df[f"lag_{lag}"] = df["y"].shift(lag)</w:t>
-        <w:br/>
-        <w:t xml:space="preserve">    df["rull_snitt_4"] = df["y"].shift(1).rolling(4).mean()</w:t>
-        <w:br/>
-        <w:t xml:space="preserve">    df["rull_snitt_8"] = df["y"].shift(1).rolling(8).mean()</w:t>
-        <w:br/>
-        <w:t xml:space="preserve">    df["uke_nr"]       = serie.index.isocalendar().week.astype(int).values</w:t>
-        <w:br/>
-        <w:t xml:space="preserve">    df["sesong_mod13"] = df["uke_nr"] % 13</w:t>
-        <w:br/>
-        <w:t xml:space="preserve">    return df.dropna()</w:t>
-        <w:br/>
-        <w:br/>
-        <w:br/>
-        <w:t>def main():</w:t>
-        <w:br/>
-        <w:t xml:space="preserve">    df = pd.read_csv(PROC / "ukentlig_salg.csv", index_col=0, parse_dates=True)</w:t>
-        <w:br/>
-        <w:t xml:space="preserve">    resultater, alle_prognoser = [], {}</w:t>
-        <w:br/>
-        <w:br/>
-        <w:t xml:space="preserve">    for kol in df.columns:</w:t>
-        <w:br/>
-        <w:t xml:space="preserve">        feat       = lag_features(df[kol])</w:t>
-        <w:br/>
-        <w:t xml:space="preserve">        split_dato = df[kol].index[int(len(df[kol]) * TRAIN_FRAC)]</w:t>
-        <w:br/>
-        <w:t xml:space="preserve">        tren = feat[feat.index &lt; split_dato]</w:t>
-        <w:br/>
-        <w:t xml:space="preserve">        test = feat[feat.index &gt;= split_dato]</w:t>
-        <w:br/>
-        <w:br/>
-        <w:t xml:space="preserve">        modell = GradientBoostingRegressor(**GB_PARAMS)</w:t>
-        <w:br/>
-        <w:t xml:space="preserve">        modell.fit(tren.drop(columns="y"), tren["y"])</w:t>
-        <w:br/>
-        <w:t xml:space="preserve">        y_hat = np.clip(modell.predict(test.drop(columns="y")), 0, None)</w:t>
-        <w:br/>
-        <w:br/>
-        <w:t xml:space="preserve">        y_test = test["y"].values</w:t>
-        <w:br/>
-        <w:t xml:space="preserve">        mask   = y_test &gt; 0</w:t>
-        <w:br/>
-        <w:t xml:space="preserve">        mape   = float(np.mean(np.abs((y_test[mask] - y_hat[mask]) / y_test[mask])) * 100)</w:t>
-        <w:br/>
-        <w:t xml:space="preserve">        resultater.append({</w:t>
-        <w:br/>
-        <w:t xml:space="preserve">            "Produkt": VISNINGSNAVN.get(kol, kol),</w:t>
-        <w:br/>
-        <w:t xml:space="preserve">            "RMSE": round(float(np.sqrt(mean_squared_error(y_test, y_hat))), 2),</w:t>
-        <w:br/>
-        <w:t xml:space="preserve">            "MAE":  round(float(mean_absolute_error(y_test, y_hat)), 2),</w:t>
-        <w:br/>
-        <w:t xml:space="preserve">            "MAPE%": round(mape, 1),</w:t>
-        <w:br/>
-        <w:t xml:space="preserve">        })</w:t>
-        <w:br/>
-        <w:t xml:space="preserve">        alle_prognoser[kol] = pd.Series(y_hat, index=test.index, name=kol)</w:t>
-        <w:br/>
-        <w:br/>
-        <w:t xml:space="preserve">    pd.DataFrame(resultater).to_csv(PROC / "gb_resultater.csv", index=False)</w:t>
-        <w:br/>
-        <w:t xml:space="preserve">    pd.DataFrame(alle_prognoser).to_csv(PROC / "gb_prognoser.csv")</w:t>
-        <w:br/>
-        <w:br/>
-        <w:br/>
-        <w:t>if __name__ == "__main__":</w:t>
-        <w:br/>
-        <w:t xml:space="preserve">    main()</w:t>
-      </w:r>
-    </w:p>
-    <w:p>
-      <w:pPr>
-        <w:pBdr>
-          <w:bottom w:val="single" w:sz="6" w:space="1" w:color="AAAAAA"/>
-        </w:pBdr>
-        <w:spacing w:before="0" w:after="120"/>
-      </w:pPr>
-    </w:p>
-    <w:p>
-      <w:pPr>
-        <w:pStyle w:val="Heading2"/>
-        <w:spacing w:before="240" w:after="80"/>
-      </w:pPr>
-      <w:r>
-        <w:rPr>
-          <w:rFonts w:ascii="Times New Roman" w:hAnsi="Times New Roman"/>
-          <w:b/>
-          <w:i w:val="0"/>
-          <w:sz w:val="26"/>
-        </w:rPr>
-        <w:t>Vedlegg F – Modellsammenlikning (`06_modellsammenlikning.py`)</w:t>
-      </w:r>
-    </w:p>
-    <w:p>
-      <w:pPr>
-        <w:spacing w:after="120" w:before="120"/>
-        <w:ind w:left="567"/>
-        <w:shd w:val="clear" w:color="auto" w:fill="F2F2F2"/>
-      </w:pPr>
-      <w:r>
-        <w:rPr>
-          <w:rFonts w:ascii="Courier New" w:hAnsi="Courier New"/>
-          <w:b w:val="0"/>
-          <w:i w:val="0"/>
-          <w:sz w:val="18"/>
-        </w:rPr>
-        <w:t>import pandas as pd</w:t>
-        <w:br/>
-        <w:t>import numpy as np</w:t>
-        <w:br/>
-        <w:t>import matplotlib.pyplot as plt</w:t>
-        <w:br/>
-        <w:t>import matplotlib.dates as mdates</w:t>
-        <w:br/>
-        <w:t>from pathlib import Path</w:t>
-        <w:br/>
-        <w:t>from sklearn.metrics import mean_squared_error, mean_absolute_error</w:t>
-        <w:br/>
-        <w:br/>
-        <w:t>ROOT    = Path(__file__).parent.parent</w:t>
-        <w:br/>
-        <w:t>PROC    = ROOT / "002_data" / "processed"</w:t>
-        <w:br/>
-        <w:t>FIGURER = ROOT / "005_report" / "figures"</w:t>
-        <w:br/>
-        <w:t>TRAIN_FRAC = 0.80</w:t>
-        <w:br/>
-        <w:br/>
-        <w:t>VISNINGSNAVN = {</w:t>
-        <w:br/>
-        <w:t xml:space="preserve">    "Terrassebord":  "Terrassebord (28x120)",  "Planke": "Planke (48x98)",</w:t>
-        <w:br/>
-        <w:t xml:space="preserve">    "Terrasseskrue": "Terrasseskrue (4,2x55)", "Skrue5x90": "Skrue 5x90",</w:t>
-        <w:br/>
-        <w:t>}</w:t>
-        <w:br/>
-        <w:br/>
-        <w:br/>
-        <w:t>def mape(y, yhat):</w:t>
-        <w:br/>
-        <w:t xml:space="preserve">    mask = y &gt; 0</w:t>
-        <w:br/>
-        <w:t xml:space="preserve">    return float(np.mean(np.abs((y[mask] - yhat[mask]) / y[mask])) * 100) if mask.sum() else np.nan</w:t>
-        <w:br/>
-        <w:br/>
-        <w:br/>
-        <w:t>def evaluer(y, yhat):</w:t>
-        <w:br/>
-        <w:t xml:space="preserve">    return {</w:t>
-        <w:br/>
-        <w:t xml:space="preserve">        "RMSE": round(float(np.sqrt(mean_squared_error(y, yhat))), 2),</w:t>
-        <w:br/>
-        <w:t xml:space="preserve">        "MAE":  round(float(mean_absolute_error(y, yhat)), 2),</w:t>
-        <w:br/>
-        <w:t xml:space="preserve">        "MAPE": round(mape(y, yhat), 1),</w:t>
-        <w:br/>
-        <w:t xml:space="preserve">    }</w:t>
-        <w:br/>
-        <w:br/>
-        <w:br/>
-        <w:t>def main():</w:t>
-        <w:br/>
-        <w:t xml:space="preserve">    df = pd.read_csv(PROC / "ukentlig_salg.csv", index_col=0, parse_dates=True)</w:t>
-        <w:br/>
-        <w:t xml:space="preserve">    sarima = pd.read_csv(PROC / "sarima_prognoser.csv", index_col=0,</w:t>
-        <w:br/>
-        <w:t xml:space="preserve">                         parse_dates=True, date_format="%Y-%m-%d")</w:t>
-        <w:br/>
-        <w:t xml:space="preserve">    gb     = pd.read_csv(PROC / "gb_prognoser.csv", index_col=0,</w:t>
-        <w:br/>
-        <w:t xml:space="preserve">                         parse_dates=True, date_format="%Y-%m-%d")</w:t>
-        <w:br/>
-        <w:t xml:space="preserve">    rader  = []</w:t>
-        <w:br/>
-        <w:br/>
-        <w:t xml:space="preserve">    for kol in df.columns:</w:t>
-        <w:br/>
-        <w:t xml:space="preserve">        n_tren     = int(len(df) * TRAIN_FRAC)</w:t>
-        <w:br/>
-        <w:t xml:space="preserve">        faktisk    = df[kol].iloc[n_tren:].values</w:t>
-        <w:br/>
-        <w:t xml:space="preserve">        test_index = df[kol].iloc[n_tren:].index</w:t>
-        <w:br/>
-        <w:br/>
-        <w:t xml:space="preserve">        # Naiv</w:t>
-        <w:br/>
-        <w:t xml:space="preserve">        naiv = df[kol].iloc[n_tren - 1:n_tren + len(faktisk) - 1].values</w:t>
-        <w:br/>
-        <w:t xml:space="preserve">        rader.append({"Produkt": VISNINGSNAVN.get(kol, kol),</w:t>
-        <w:br/>
-        <w:t xml:space="preserve">                      "Modell": "Naiv", **evaluer(faktisk, naiv)})</w:t>
-        <w:br/>
-        <w:t xml:space="preserve">        # SARIMA</w:t>
-        <w:br/>
-        <w:t xml:space="preserve">        s_p = sarima[kol].reindex(test_index).ffill().bfill().values[:len(faktisk)]</w:t>
-        <w:br/>
-        <w:t xml:space="preserve">        rader.append({"Produkt": VISNINGSNAVN.get(kol, kol),</w:t>
-        <w:br/>
-        <w:t xml:space="preserve">                      "Modell": "SARIMA", **evaluer(faktisk, s_p)})</w:t>
-        <w:br/>
-        <w:t xml:space="preserve">        # GB</w:t>
-        <w:br/>
-        <w:t xml:space="preserve">        g_p = gb[kol].reindex(test_index).ffill().bfill().values[:len(faktisk)]</w:t>
-        <w:br/>
-        <w:t xml:space="preserve">        rader.append({"Produkt": VISNINGSNAVN.get(kol, kol),</w:t>
-        <w:br/>
-        <w:t xml:space="preserve">                      "Modell": "Gradient Boosting", **evaluer(faktisk, g_p)})</w:t>
-        <w:br/>
-        <w:br/>
-        <w:t xml:space="preserve">    pd.DataFrame(rader).to_csv(PROC / "tabell_6_2_modellsammenlikning.csv", index=False)</w:t>
-        <w:br/>
-        <w:br/>
-        <w:br/>
-        <w:t>if __name__ == "__main__":</w:t>
-        <w:br/>
-        <w:t xml:space="preserve">    main()</w:t>
-      </w:r>
-    </w:p>
-    <w:p>
-      <w:pPr>
-        <w:pBdr>
-          <w:bottom w:val="single" w:sz="6" w:space="1" w:color="AAAAAA"/>
-        </w:pBdr>
-        <w:spacing w:before="0" w:after="120"/>
-      </w:pPr>
-    </w:p>
-    <w:p>
-      <w:pPr>
-        <w:pStyle w:val="Heading2"/>
-        <w:spacing w:before="240" w:after="80"/>
-      </w:pPr>
-      <w:r>
-        <w:rPr>
-          <w:rFonts w:ascii="Times New Roman" w:hAnsi="Times New Roman"/>
-          <w:b/>
-          <w:i w:val="0"/>
-          <w:sz w:val="26"/>
-        </w:rPr>
-        <w:t>Vedlegg G – Lagerstyring og simulering (`07_lagerstyring.py`)</w:t>
-      </w:r>
-    </w:p>
-    <w:p>
-      <w:pPr>
-        <w:spacing w:after="120" w:before="120"/>
-        <w:ind w:left="567"/>
-        <w:shd w:val="clear" w:color="auto" w:fill="F2F2F2"/>
-      </w:pPr>
-      <w:r>
-        <w:rPr>
-          <w:rFonts w:ascii="Courier New" w:hAnsi="Courier New"/>
-          <w:b w:val="0"/>
-          <w:i w:val="0"/>
-          <w:sz w:val="18"/>
-        </w:rPr>
-        <w:t>import pandas as pd</w:t>
-        <w:br/>
-        <w:t>import numpy as np</w:t>
-        <w:br/>
-        <w:t>import matplotlib.pyplot as plt</w:t>
-        <w:br/>
-        <w:t>import matplotlib.dates as mdates</w:t>
-        <w:br/>
-        <w:t>from pathlib import Path</w:t>
-        <w:br/>
-        <w:br/>
-        <w:t>ROOT    = Path(__file__).parent.parent</w:t>
-        <w:br/>
-        <w:t>PROC    = ROOT / "002_data" / "processed"</w:t>
-        <w:br/>
-        <w:t>FIGURER = ROOT / "005_report" / "figures"</w:t>
-        <w:br/>
-        <w:br/>
-        <w:t>Z, L, K, H_RATE = 1.645, 1, 500, 0.25</w:t>
-        <w:br/>
-        <w:t>VAREPRIS = {"Terrassebord": 24, "Planke": 29, "Terrasseskrue": 108, "Skrue5x90": 90}</w:t>
-        <w:br/>
-        <w:t>VISNINGSNAVN = {</w:t>
-        <w:br/>
-        <w:t xml:space="preserve">    "Terrassebord":  "Terrassebord (28x120)",  "Planke": "Planke (48x98)",</w:t>
-        <w:br/>
-        <w:t xml:space="preserve">    "Terrasseskrue": "Terrasseskrue (4,2x55)", "Skrue5x90": "Skrue 5x90",</w:t>
-        <w:br/>
-        <w:t>}</w:t>
-        <w:br/>
-        <w:br/>
-        <w:br/>
-        <w:t>def beregn(df):</w:t>
-        <w:br/>
-        <w:t xml:space="preserve">    rader = []</w:t>
-        <w:br/>
-        <w:t xml:space="preserve">    for kol in df.columns:</w:t>
-        <w:br/>
-        <w:t xml:space="preserve">        mu, std = df[kol].mean(), df[kol].std()</w:t>
-        <w:br/>
-        <w:t xml:space="preserve">        h = VAREPRIS.get(kol, 50) * H_RATE</w:t>
-        <w:br/>
-        <w:t xml:space="preserve">        ss, rop, eoq = (Z * std * np.sqrt(L),</w:t>
-        <w:br/>
-        <w:t xml:space="preserve">                        mu * L + Z * std * np.sqrt(L),</w:t>
-        <w:br/>
-        <w:t xml:space="preserve">                        np.sqrt(2 * K * mu * 52 / h))</w:t>
-        <w:br/>
-        <w:t xml:space="preserve">        rader.append({"Produkt": VISNINGSNAVN.get(kol, kol), "L": L,</w:t>
-        <w:br/>
-        <w:t xml:space="preserve">                      "μ": round(mu, 1), "σ_d": round(std, 1),</w:t>
-        <w:br/>
-        <w:t xml:space="preserve">                      "SS": round(ss, 1), "ROP": round(rop, 1), "Q*": round(eoq)})</w:t>
-        <w:br/>
-        <w:t xml:space="preserve">    return pd.DataFrame(rader)</w:t>
-        <w:br/>
-        <w:br/>
-        <w:br/>
-        <w:t>def sim_a(serie, mu):</w:t>
-        <w:br/>
-        <w:t xml:space="preserve">    lager, utsalg, beh = np.zeros(len(serie)), np.zeros(len(serie)), mu * 1.5</w:t>
-        <w:br/>
-        <w:t xml:space="preserve">    for t, d in enumerate(serie.values):</w:t>
-        <w:br/>
-        <w:t xml:space="preserve">        utsalg[t] = max(d - beh, 0)</w:t>
-        <w:br/>
-        <w:t xml:space="preserve">        beh = max(beh - d, 0)</w:t>
-        <w:br/>
-        <w:t xml:space="preserve">        lager[t] = beh</w:t>
-        <w:br/>
-        <w:t xml:space="preserve">        if beh &lt; mu * 0.5:</w:t>
-        <w:br/>
-        <w:t xml:space="preserve">            beh += mu * 2</w:t>
-        <w:br/>
-        <w:t xml:space="preserve">    return lager, utsalg</w:t>
-        <w:br/>
-        <w:br/>
-        <w:br/>
-        <w:t>def sim_b(serie, ss, rop, q):</w:t>
-        <w:br/>
-        <w:t xml:space="preserve">    lager, utsalg, beh = np.zeros(len(serie)), np.zeros(len(serie)), rop + q</w:t>
-        <w:br/>
-        <w:t xml:space="preserve">    for t, d in enumerate(serie.values):</w:t>
-        <w:br/>
-        <w:t xml:space="preserve">        utsalg[t] = max(d - beh, 0)</w:t>
-        <w:br/>
-        <w:t xml:space="preserve">        beh = max(beh - d, 0)</w:t>
-        <w:br/>
-        <w:t xml:space="preserve">        lager[t] = beh</w:t>
-        <w:br/>
-        <w:t xml:space="preserve">        if beh &lt; rop:</w:t>
-        <w:br/>
-        <w:t xml:space="preserve">            beh += q</w:t>
-        <w:br/>
-        <w:t xml:space="preserve">    return lager, utsalg</w:t>
-        <w:br/>
-        <w:br/>
-        <w:br/>
-        <w:t>def main():</w:t>
-        <w:br/>
-        <w:t xml:space="preserve">    df     = pd.read_csv(PROC / "ukentlig_salg.csv", index_col=0, parse_dates=True)</w:t>
-        <w:br/>
-        <w:t xml:space="preserve">    params = beregn(df)</w:t>
-        <w:br/>
-        <w:t xml:space="preserve">    params.to_csv(PROC / "tabell_6_3_lagerstorrelser.csv", index=False)</w:t>
-        <w:br/>
-        <w:br/>
-        <w:t xml:space="preserve">    rader = []</w:t>
-        <w:br/>
-        <w:t xml:space="preserve">    for kol in df.columns:</w:t>
-        <w:br/>
-        <w:t xml:space="preserve">        p = params[params["Produkt"] == VISNINGSNAVN.get(kol, kol)].iloc[0]</w:t>
-        <w:br/>
-        <w:t xml:space="preserve">        la, ua = sim_a(df[kol], float(p["μ"]))</w:t>
-        <w:br/>
-        <w:t xml:space="preserve">        lb, ub = sim_b(df[kol], float(p["SS"]), float(p["ROP"]), float(p["Q*"]))</w:t>
-        <w:br/>
-        <w:t xml:space="preserve">        rader.append({</w:t>
-        <w:br/>
-        <w:t xml:space="preserve">            "Produkt": VISNINGSNAVN.get(kol, kol),</w:t>
-        <w:br/>
-        <w:t xml:space="preserve">            "Lager A": round(np.mean(la), 1), "Lager B": round(np.mean(lb), 1),</w:t>
-        <w:br/>
-        <w:t xml:space="preserve">            "Utsalg A": round(np.sum(ua), 1), "Utsalg B": round(np.sum(ub), 1),</w:t>
-        <w:br/>
-        <w:t xml:space="preserve">            "Forbedring": round(np.sum(ua) - np.sum(ub), 1),</w:t>
-        <w:br/>
-        <w:t xml:space="preserve">        })</w:t>
-        <w:br/>
-        <w:t xml:space="preserve">    pd.DataFrame(rader).to_csv(PROC / "tabell_6_4_simulering.csv", index=False)</w:t>
-        <w:br/>
-        <w:br/>
-        <w:br/>
-        <w:t>if __name__ == "__main__":</w:t>
-        <w:br/>
-        <w:t xml:space="preserve">    main()</w:t>
-      </w:r>
-    </w:p>
     <w:sectPr>
       <w:pgSz w:w="11906" w:h="16838"/>
       <w:pgMar w:top="1417" w:right="1417" w:bottom="1417" w:left="1984" w:header="720" w:footer="720" w:gutter="0"/>

</xml_diff>